<commit_message>
TS 4.5 and 4.6 Jatai Ghanam version 2.0
</commit_message>
<xml_diff>
--- a/TS Jatai Ghanam Project/TS 4.5/TS 4.5 Jatai Tamil Corrections.docx
+++ b/TS Jatai Ghanam Project/TS 4.5/TS 4.5 Jatai Tamil Corrections.docx
@@ -255,23 +255,7 @@
                 <w:rFonts w:cs="BRH Malayalam Extra"/>
                 <w:szCs w:val="40"/>
               </w:rPr>
-              <w:t xml:space="preserve">NONE     NONE   </w:t>
-            </w:r>
-            <w:proofErr w:type="gramStart"/>
-            <w:r>
-              <w:rPr>
-                <w:rFonts w:cs="BRH Malayalam Extra"/>
-                <w:szCs w:val="40"/>
-              </w:rPr>
-              <w:t xml:space="preserve">NONE,   </w:t>
-            </w:r>
-            <w:proofErr w:type="gramEnd"/>
-            <w:r>
-              <w:rPr>
-                <w:rFonts w:cs="BRH Malayalam Extra"/>
-                <w:szCs w:val="40"/>
-              </w:rPr>
-              <w:t>NONE</w:t>
+              <w:t>NONE     NONE   NONE,   NONE</w:t>
             </w:r>
           </w:p>
         </w:tc>
@@ -303,23 +287,7 @@
                 <w:rFonts w:cs="BRH Malayalam Extra"/>
                 <w:szCs w:val="40"/>
               </w:rPr>
-              <w:t xml:space="preserve">NONE     NONE   </w:t>
-            </w:r>
-            <w:proofErr w:type="gramStart"/>
-            <w:r>
-              <w:rPr>
-                <w:rFonts w:cs="BRH Malayalam Extra"/>
-                <w:szCs w:val="40"/>
-              </w:rPr>
-              <w:t xml:space="preserve">NONE,   </w:t>
-            </w:r>
-            <w:proofErr w:type="gramEnd"/>
-            <w:r>
-              <w:rPr>
-                <w:rFonts w:cs="BRH Malayalam Extra"/>
-                <w:szCs w:val="40"/>
-              </w:rPr>
-              <w:t>NONE</w:t>
+              <w:t>NONE     NONE   NONE,   NONE</w:t>
             </w:r>
           </w:p>
         </w:tc>
@@ -360,32 +328,6 @@
           <w:u w:val="single"/>
         </w:rPr>
       </w:pPr>
-    </w:p>
-    <w:p>
-      <w:pPr>
-        <w:spacing w:before="0" w:line="240" w:lineRule="auto"/>
-        <w:jc w:val="center"/>
-        <w:rPr>
-          <w:b/>
-          <w:bCs/>
-          <w:sz w:val="32"/>
-          <w:szCs w:val="32"/>
-          <w:u w:val="single"/>
-        </w:rPr>
-      </w:pPr>
-    </w:p>
-    <w:p>
-      <w:pPr>
-        <w:spacing w:before="0" w:line="240" w:lineRule="auto"/>
-        <w:jc w:val="center"/>
-        <w:rPr>
-          <w:b/>
-          <w:bCs/>
-          <w:sz w:val="32"/>
-          <w:szCs w:val="32"/>
-          <w:u w:val="single"/>
-        </w:rPr>
-      </w:pPr>
       <w:r>
         <w:rPr>
           <w:b/>
@@ -396,7 +338,6 @@
         </w:rPr>
         <w:t xml:space="preserve">TS </w:t>
       </w:r>
-      <w:proofErr w:type="gramStart"/>
       <w:r>
         <w:rPr>
           <w:b/>
@@ -425,18 +366,7 @@
           <w:szCs w:val="32"/>
           <w:u w:val="single"/>
         </w:rPr>
-        <w:t>–</w:t>
-      </w:r>
-      <w:proofErr w:type="gramEnd"/>
-      <w:r>
-        <w:rPr>
-          <w:b/>
-          <w:bCs/>
-          <w:sz w:val="32"/>
-          <w:szCs w:val="32"/>
-          <w:u w:val="single"/>
-        </w:rPr>
-        <w:t xml:space="preserve"> TS </w:t>
+        <w:t xml:space="preserve">– TS </w:t>
       </w:r>
       <w:r>
         <w:rPr>
@@ -4082,7 +4012,6 @@
         </w:rPr>
         <w:t xml:space="preserve">TS </w:t>
       </w:r>
-      <w:proofErr w:type="gramStart"/>
       <w:r>
         <w:rPr>
           <w:b/>
@@ -4111,18 +4040,7 @@
           <w:szCs w:val="32"/>
           <w:u w:val="single"/>
         </w:rPr>
-        <w:t>–</w:t>
-      </w:r>
-      <w:proofErr w:type="gramEnd"/>
-      <w:r>
-        <w:rPr>
-          <w:b/>
-          <w:bCs/>
-          <w:sz w:val="32"/>
-          <w:szCs w:val="32"/>
-          <w:u w:val="single"/>
-        </w:rPr>
-        <w:t xml:space="preserve"> TS </w:t>
+        <w:t xml:space="preserve">– TS </w:t>
       </w:r>
       <w:r>
         <w:rPr>

</xml_diff>